<commit_message>
Correction from 64 MHz to 72 MHz on FIR LAB
</commit_message>
<xml_diff>
--- a/L2 - FIR Filter.docx
+++ b/L2 - FIR Filter.docx
@@ -1557,7 +1557,7 @@
           <w:rFonts w:ascii="Arial Narrow" w:hAnsi="Arial Narrow"/>
           <w:lang w:val="en-US"/>
         </w:rPr>
-        <w:t>64</w:t>
+        <w:t>72</w:t>
       </w:r>
       <w:r>
         <w:rPr>
@@ -1682,7 +1682,18 @@
           <w:szCs w:val="18"/>
           <w:lang w:val="en-US"/>
         </w:rPr>
-        <w:t xml:space="preserve">48 </w:t>
+        <w:t>72</w:t>
+      </w:r>
+      <w:r>
+        <w:rPr>
+          <w:rFonts w:ascii="Arial Narrow" w:hAnsi="Arial Narrow"/>
+          <w:i/>
+          <w:iCs/>
+          <w:sz w:val="18"/>
+          <w:szCs w:val="18"/>
+          <w:lang w:val="en-US"/>
+        </w:rPr>
+        <w:t xml:space="preserve"> </w:t>
       </w:r>
       <w:r>
         <w:rPr>
@@ -1848,7 +1859,7 @@
           <w:szCs w:val="20"/>
           <w:lang w:val="en-US"/>
         </w:rPr>
-        <w:t>64</w:t>
+        <w:t>72</w:t>
       </w:r>
       <w:r>
         <w:rPr>
@@ -2569,9 +2580,15 @@
             <w:r>
               <w:rPr>
                 <w:rFonts w:ascii="Arial Narrow" w:hAnsi="Arial Narrow" w:cs="Arial"/>
-                <w:lang w:val="en-US"/>
-              </w:rPr>
-              <w:t xml:space="preserve">  // [13:9]:</w:t>
+              </w:rPr>
+              <w:t xml:space="preserve">  </w:t>
+            </w:r>
+            <w:r>
+              <w:rPr>
+                <w:rFonts w:ascii="Arial Narrow" w:hAnsi="Arial Narrow" w:cs="Arial"/>
+                <w:lang w:val="en-US"/>
+              </w:rPr>
+              <w:t>// [13:9]:</w:t>
             </w:r>
             <w:r>
               <w:rPr>
@@ -2824,9 +2841,15 @@
             <w:r>
               <w:rPr>
                 <w:rFonts w:ascii="Arial Narrow" w:hAnsi="Arial Narrow" w:cs="Arial"/>
-                <w:lang w:val="en-US"/>
-              </w:rPr>
-              <w:t xml:space="preserve">  // [29:28]:</w:t>
+              </w:rPr>
+              <w:t xml:space="preserve">  </w:t>
+            </w:r>
+            <w:r>
+              <w:rPr>
+                <w:rFonts w:ascii="Arial Narrow" w:hAnsi="Arial Narrow" w:cs="Arial"/>
+                <w:lang w:val="en-US"/>
+              </w:rPr>
+              <w:t>// [29:28]:</w:t>
             </w:r>
             <w:r>
               <w:rPr>
@@ -3089,7 +3112,45 @@
                 <w:rFonts w:ascii="Arial Narrow" w:hAnsi="Arial Narrow" w:cs="Arial"/>
                 <w:lang w:val="en-US"/>
               </w:rPr>
-              <w:t>~ADC_CR_ADVREGEN;</w:t>
+              <w:t xml:space="preserve">~ADC_CR_ADVREGEN; </w:t>
+            </w:r>
+            <w:r>
+              <w:rPr>
+                <w:rFonts w:ascii="Arial Narrow" w:hAnsi="Arial Narrow" w:cs="Arial"/>
+                <w:lang w:val="en-US"/>
+              </w:rPr>
+              <w:tab/>
+              <w:t xml:space="preserve">// </w:t>
+            </w:r>
+            <w:r>
+              <w:rPr>
+                <w:rFonts w:ascii="Arial Narrow" w:hAnsi="Arial Narrow" w:cs="Arial"/>
+                <w:lang w:val="en-US"/>
+              </w:rPr>
+              <w:t xml:space="preserve">  </w:t>
+            </w:r>
+            <w:r>
+              <w:rPr>
+                <w:rFonts w:ascii="Arial Narrow" w:hAnsi="Arial Narrow" w:cs="Arial"/>
+                <w:lang w:val="en-US"/>
+              </w:rPr>
+              <w:t>In order to enable the regulator, first it must be switched</w:t>
+            </w:r>
+          </w:p>
+          <w:p>
+            <w:pPr>
+              <w:spacing w:after="0" w:line="240" w:lineRule="auto"/>
+              <w:rPr>
+                <w:rFonts w:ascii="Arial Narrow" w:hAnsi="Arial Narrow" w:cs="Arial"/>
+                <w:lang w:val="en-US"/>
+              </w:rPr>
+            </w:pPr>
+            <w:r>
+              <w:rPr>
+                <w:rFonts w:ascii="Arial Narrow" w:hAnsi="Arial Narrow" w:cs="Arial"/>
+                <w:lang w:val="en-US"/>
+              </w:rPr>
+              <w:t xml:space="preserve">  ADC4-&gt;CR</w:t>
             </w:r>
             <w:r>
               <w:rPr>
@@ -3103,6 +3164,86 @@
                 <w:rFonts w:ascii="Arial Narrow" w:hAnsi="Arial Narrow" w:cs="Arial"/>
                 <w:lang w:val="en-US"/>
               </w:rPr>
+              <w:t>|=</w:t>
+            </w:r>
+            <w:r>
+              <w:rPr>
+                <w:rFonts w:ascii="Arial Narrow" w:hAnsi="Arial Narrow" w:cs="Arial"/>
+                <w:lang w:val="en-US"/>
+              </w:rPr>
+              <w:t xml:space="preserve"> </w:t>
+            </w:r>
+            <w:r>
+              <w:rPr>
+                <w:rFonts w:ascii="Arial Narrow" w:hAnsi="Arial Narrow" w:cs="Arial"/>
+                <w:lang w:val="en-US"/>
+              </w:rPr>
+              <w:t xml:space="preserve">ADC_CR_ADVREGEN_0; </w:t>
+            </w:r>
+            <w:r>
+              <w:rPr>
+                <w:rFonts w:ascii="Arial Narrow" w:hAnsi="Arial Narrow" w:cs="Arial"/>
+                <w:lang w:val="en-US"/>
+              </w:rPr>
+              <w:tab/>
+              <w:t>// into the intermediate state</w:t>
+            </w:r>
+            <w:r>
+              <w:rPr>
+                <w:rFonts w:ascii="Arial Narrow" w:hAnsi="Arial Narrow" w:cs="Arial"/>
+                <w:lang w:val="en-US"/>
+              </w:rPr>
+              <w:t xml:space="preserve"> (OFF)</w:t>
+            </w:r>
+            <w:r>
+              <w:rPr>
+                <w:rFonts w:ascii="Arial Narrow" w:hAnsi="Arial Narrow" w:cs="Arial"/>
+                <w:lang w:val="en-US"/>
+              </w:rPr>
+              <w:t>, then into the enabled one</w:t>
+            </w:r>
+          </w:p>
+          <w:p>
+            <w:pPr>
+              <w:spacing w:after="0" w:line="240" w:lineRule="auto"/>
+              <w:rPr>
+                <w:rFonts w:ascii="Arial Narrow" w:hAnsi="Arial Narrow" w:cs="Arial"/>
+                <w:lang w:val="en-US"/>
+              </w:rPr>
+            </w:pPr>
+            <w:r>
+              <w:rPr>
+                <w:rFonts w:ascii="Arial Narrow" w:hAnsi="Arial Narrow" w:cs="Arial"/>
+                <w:lang w:val="en-US"/>
+              </w:rPr>
+              <w:t xml:space="preserve">  HAL_Delay(1); </w:t>
+            </w:r>
+            <w:r>
+              <w:rPr>
+                <w:rFonts w:ascii="Arial Narrow" w:hAnsi="Arial Narrow" w:cs="Arial"/>
+                <w:lang w:val="en-US"/>
+              </w:rPr>
+              <w:tab/>
+            </w:r>
+            <w:r>
+              <w:rPr>
+                <w:rFonts w:ascii="Arial Narrow" w:hAnsi="Arial Narrow" w:cs="Arial"/>
+                <w:lang w:val="en-US"/>
+              </w:rPr>
+              <w:tab/>
+            </w:r>
+            <w:r>
+              <w:rPr>
+                <w:rFonts w:ascii="Arial Narrow" w:hAnsi="Arial Narrow" w:cs="Arial"/>
+                <w:lang w:val="en-US"/>
+              </w:rPr>
+              <w:tab/>
+            </w:r>
+            <w:r>
+              <w:rPr>
+                <w:rFonts w:ascii="Arial Narrow" w:hAnsi="Arial Narrow" w:cs="Arial"/>
+                <w:lang w:val="en-US"/>
+              </w:rPr>
               <w:tab/>
               <w:t xml:space="preserve">// </w:t>
             </w:r>
@@ -3111,14 +3252,14 @@
                 <w:rFonts w:ascii="Arial Narrow" w:hAnsi="Arial Narrow" w:cs="Arial"/>
                 <w:lang w:val="en-US"/>
               </w:rPr>
-              <w:t xml:space="preserve">  </w:t>
-            </w:r>
-            <w:r>
-              <w:rPr>
-                <w:rFonts w:ascii="Arial Narrow" w:hAnsi="Arial Narrow" w:cs="Arial"/>
-                <w:lang w:val="en-US"/>
-              </w:rPr>
-              <w:t>In order to enable the regulator, first it must be switched</w:t>
+              <w:t xml:space="preserve">(ON) and </w:t>
+            </w:r>
+            <w:r>
+              <w:rPr>
+                <w:rFonts w:ascii="Arial Narrow" w:hAnsi="Arial Narrow" w:cs="Arial"/>
+                <w:lang w:val="en-US"/>
+              </w:rPr>
+              <w:t>finally must wait ~1ms in order to stabilize</w:t>
             </w:r>
           </w:p>
           <w:p>
@@ -3162,145 +3303,6 @@
                 <w:rFonts w:ascii="Arial Narrow" w:hAnsi="Arial Narrow" w:cs="Arial"/>
                 <w:lang w:val="en-US"/>
               </w:rPr>
-              <w:t>ADC_CR_ADVREGEN_0;</w:t>
-            </w:r>
-            <w:r>
-              <w:rPr>
-                <w:rFonts w:ascii="Arial Narrow" w:hAnsi="Arial Narrow" w:cs="Arial"/>
-                <w:lang w:val="en-US"/>
-              </w:rPr>
-              <w:t xml:space="preserve"> </w:t>
-            </w:r>
-            <w:r>
-              <w:rPr>
-                <w:rFonts w:ascii="Arial Narrow" w:hAnsi="Arial Narrow" w:cs="Arial"/>
-                <w:lang w:val="en-US"/>
-              </w:rPr>
-              <w:tab/>
-              <w:t>// into the intermediate state</w:t>
-            </w:r>
-            <w:r>
-              <w:rPr>
-                <w:rFonts w:ascii="Arial Narrow" w:hAnsi="Arial Narrow" w:cs="Arial"/>
-                <w:lang w:val="en-US"/>
-              </w:rPr>
-              <w:t xml:space="preserve"> (OFF)</w:t>
-            </w:r>
-            <w:r>
-              <w:rPr>
-                <w:rFonts w:ascii="Arial Narrow" w:hAnsi="Arial Narrow" w:cs="Arial"/>
-                <w:lang w:val="en-US"/>
-              </w:rPr>
-              <w:t>, then into the enabled one</w:t>
-            </w:r>
-          </w:p>
-          <w:p>
-            <w:pPr>
-              <w:spacing w:after="0" w:line="240" w:lineRule="auto"/>
-              <w:rPr>
-                <w:rFonts w:ascii="Arial Narrow" w:hAnsi="Arial Narrow" w:cs="Arial"/>
-                <w:lang w:val="en-US"/>
-              </w:rPr>
-            </w:pPr>
-            <w:r>
-              <w:rPr>
-                <w:rFonts w:ascii="Arial Narrow" w:hAnsi="Arial Narrow" w:cs="Arial"/>
-                <w:lang w:val="en-US"/>
-              </w:rPr>
-              <w:t xml:space="preserve">  HAL_Delay(1);</w:t>
-            </w:r>
-            <w:r>
-              <w:rPr>
-                <w:rFonts w:ascii="Arial Narrow" w:hAnsi="Arial Narrow" w:cs="Arial"/>
-                <w:lang w:val="en-US"/>
-              </w:rPr>
-              <w:t xml:space="preserve"> </w:t>
-            </w:r>
-            <w:r>
-              <w:rPr>
-                <w:rFonts w:ascii="Arial Narrow" w:hAnsi="Arial Narrow" w:cs="Arial"/>
-                <w:lang w:val="en-US"/>
-              </w:rPr>
-              <w:tab/>
-            </w:r>
-            <w:r>
-              <w:rPr>
-                <w:rFonts w:ascii="Arial Narrow" w:hAnsi="Arial Narrow" w:cs="Arial"/>
-                <w:lang w:val="en-US"/>
-              </w:rPr>
-              <w:tab/>
-            </w:r>
-            <w:r>
-              <w:rPr>
-                <w:rFonts w:ascii="Arial Narrow" w:hAnsi="Arial Narrow" w:cs="Arial"/>
-                <w:lang w:val="en-US"/>
-              </w:rPr>
-              <w:tab/>
-            </w:r>
-            <w:r>
-              <w:rPr>
-                <w:rFonts w:ascii="Arial Narrow" w:hAnsi="Arial Narrow" w:cs="Arial"/>
-                <w:lang w:val="en-US"/>
-              </w:rPr>
-              <w:tab/>
-              <w:t xml:space="preserve">// </w:t>
-            </w:r>
-            <w:r>
-              <w:rPr>
-                <w:rFonts w:ascii="Arial Narrow" w:hAnsi="Arial Narrow" w:cs="Arial"/>
-                <w:lang w:val="en-US"/>
-              </w:rPr>
-              <w:t xml:space="preserve">(ON) and </w:t>
-            </w:r>
-            <w:r>
-              <w:rPr>
-                <w:rFonts w:ascii="Arial Narrow" w:hAnsi="Arial Narrow" w:cs="Arial"/>
-                <w:lang w:val="en-US"/>
-              </w:rPr>
-              <w:t>finally must wait ~1ms in order to stabilize</w:t>
-            </w:r>
-          </w:p>
-          <w:p>
-            <w:pPr>
-              <w:spacing w:after="0" w:line="240" w:lineRule="auto"/>
-              <w:rPr>
-                <w:rFonts w:ascii="Arial Narrow" w:hAnsi="Arial Narrow" w:cs="Arial"/>
-                <w:lang w:val="en-US"/>
-              </w:rPr>
-            </w:pPr>
-            <w:r>
-              <w:rPr>
-                <w:rFonts w:ascii="Arial Narrow" w:hAnsi="Arial Narrow" w:cs="Arial"/>
-                <w:lang w:val="en-US"/>
-              </w:rPr>
-              <w:t xml:space="preserve">  ADC4-&gt;CR</w:t>
-            </w:r>
-            <w:r>
-              <w:rPr>
-                <w:rFonts w:ascii="Arial Narrow" w:hAnsi="Arial Narrow" w:cs="Arial"/>
-                <w:lang w:val="en-US"/>
-              </w:rPr>
-              <w:t xml:space="preserve"> </w:t>
-            </w:r>
-            <w:r>
-              <w:rPr>
-                <w:rFonts w:ascii="Arial Narrow" w:hAnsi="Arial Narrow" w:cs="Arial"/>
-                <w:lang w:val="en-US"/>
-              </w:rPr>
-              <w:t>|=</w:t>
-            </w:r>
-            <w:r>
-              <w:rPr>
-                <w:rFonts w:ascii="Arial Narrow" w:hAnsi="Arial Narrow" w:cs="Arial"/>
-                <w:lang w:val="en-US"/>
-              </w:rPr>
-              <w:t xml:space="preserve"> </w:t>
-            </w:r>
-            <w:r>
-              <w:rPr>
-                <w:rFonts w:ascii="Arial Narrow" w:hAnsi="Arial Narrow" w:cs="Arial"/>
-                <w:lang w:val="en-US"/>
-              </w:rPr>
               <w:t>ADC_CR_ADCAL;</w:t>
             </w:r>
           </w:p>
@@ -3317,14 +3319,7 @@
                 <w:rFonts w:ascii="Arial Narrow" w:hAnsi="Arial Narrow" w:cs="Arial"/>
                 <w:lang w:val="en-US"/>
               </w:rPr>
-              <w:t xml:space="preserve">  while( ADC4-&gt;CR &amp; ADC_CR_ADCAL );</w:t>
-            </w:r>
-            <w:r>
-              <w:rPr>
-                <w:rFonts w:ascii="Arial Narrow" w:hAnsi="Arial Narrow" w:cs="Arial"/>
-                <w:lang w:val="en-US"/>
-              </w:rPr>
-              <w:t xml:space="preserve"> </w:t>
+              <w:t xml:space="preserve">  while( ADC4-&gt;CR &amp; ADC_CR_ADCAL ); </w:t>
             </w:r>
             <w:r>
               <w:rPr>
@@ -3802,7 +3797,70 @@
                 <w:lang w:val="en-US"/>
               </w:rPr>
               <w:tab/>
-              <w:t>L[3:0]:</w:t>
+              <w:t xml:space="preserve">L[3:0]: </w:t>
+            </w:r>
+            <w:r>
+              <w:rPr>
+                <w:rFonts w:ascii="Arial Narrow" w:hAnsi="Arial Narrow" w:cs="Arial"/>
+                <w:lang w:val="en-US"/>
+              </w:rPr>
+              <w:tab/>
+            </w:r>
+            <w:r>
+              <w:rPr>
+                <w:rFonts w:ascii="Arial Narrow" w:hAnsi="Arial Narrow" w:cs="Arial"/>
+                <w:lang w:val="en-US"/>
+              </w:rPr>
+              <w:tab/>
+              <w:t>Regular channel sequence length</w:t>
+            </w:r>
+            <w:r>
+              <w:rPr>
+                <w:rFonts w:ascii="Arial Narrow" w:hAnsi="Arial Narrow" w:cs="Arial"/>
+                <w:lang w:val="en-US"/>
+              </w:rPr>
+              <w:tab/>
+              <w:t>=</w:t>
+            </w:r>
+            <w:r>
+              <w:rPr>
+                <w:rFonts w:ascii="Arial Narrow" w:hAnsi="Arial Narrow" w:cs="Arial"/>
+                <w:lang w:val="en-US"/>
+              </w:rPr>
+              <w:tab/>
+              <w:t>0000</w:t>
+            </w:r>
+            <w:r>
+              <w:rPr>
+                <w:rFonts w:ascii="Arial Narrow" w:hAnsi="Arial Narrow" w:cs="Arial"/>
+                <w:lang w:val="en-US"/>
+              </w:rPr>
+              <w:tab/>
+              <w:t>-&gt;</w:t>
+            </w:r>
+            <w:r>
+              <w:rPr>
+                <w:rFonts w:ascii="Arial Narrow" w:hAnsi="Arial Narrow" w:cs="Arial"/>
+                <w:lang w:val="en-US"/>
+              </w:rPr>
+              <w:tab/>
+              <w:t>1 conversion</w:t>
+            </w:r>
+          </w:p>
+          <w:p>
+            <w:pPr>
+              <w:spacing w:after="0" w:line="240" w:lineRule="auto"/>
+              <w:rPr>
+                <w:rFonts w:ascii="Arial Narrow" w:hAnsi="Arial Narrow" w:cs="Arial"/>
+                <w:lang w:val="en-US"/>
+              </w:rPr>
+            </w:pPr>
+            <w:r>
+              <w:rPr>
+                <w:rFonts w:ascii="Arial Narrow" w:hAnsi="Arial Narrow" w:cs="Arial"/>
+                <w:lang w:val="en-US"/>
+              </w:rPr>
+              <w:t xml:space="preserve">  // [10:6]:</w:t>
             </w:r>
             <w:r>
               <w:rPr>
@@ -3816,15 +3874,15 @@
                 <w:rFonts w:ascii="Arial Narrow" w:hAnsi="Arial Narrow" w:cs="Arial"/>
                 <w:lang w:val="en-US"/>
               </w:rPr>
-              <w:tab/>
-            </w:r>
-            <w:r>
-              <w:rPr>
-                <w:rFonts w:ascii="Arial Narrow" w:hAnsi="Arial Narrow" w:cs="Arial"/>
-                <w:lang w:val="en-US"/>
-              </w:rPr>
-              <w:tab/>
-              <w:t>Regular channel sequence length</w:t>
+              <w:t>SQ1[4:0]:</w:t>
+            </w:r>
+            <w:r>
+              <w:rPr>
+                <w:rFonts w:ascii="Arial Narrow" w:hAnsi="Arial Narrow" w:cs="Arial"/>
+                <w:lang w:val="en-US"/>
+              </w:rPr>
+              <w:tab/>
+              <w:t>1st conversion in regular sequence</w:t>
             </w:r>
             <w:r>
               <w:rPr>
@@ -3840,7 +3898,7 @@
                 <w:lang w:val="en-US"/>
               </w:rPr>
               <w:tab/>
-              <w:t>0000</w:t>
+              <w:t>00101</w:t>
             </w:r>
             <w:r>
               <w:rPr>
@@ -3856,23 +3914,183 @@
                 <w:lang w:val="en-US"/>
               </w:rPr>
               <w:tab/>
-              <w:t>1 conversion</w:t>
-            </w:r>
-          </w:p>
-          <w:p>
-            <w:pPr>
-              <w:spacing w:after="0" w:line="240" w:lineRule="auto"/>
-              <w:rPr>
-                <w:rFonts w:ascii="Arial Narrow" w:hAnsi="Arial Narrow" w:cs="Arial"/>
-                <w:lang w:val="en-US"/>
-              </w:rPr>
-            </w:pPr>
-            <w:r>
-              <w:rPr>
-                <w:rFonts w:ascii="Arial Narrow" w:hAnsi="Arial Narrow" w:cs="Arial"/>
-                <w:lang w:val="en-US"/>
-              </w:rPr>
-              <w:t xml:space="preserve">  // [10:6]:</w:t>
+              <w:t>Channel 5 is mapped into 1st</w:t>
+            </w:r>
+          </w:p>
+          <w:p>
+            <w:pPr>
+              <w:spacing w:after="0" w:line="240" w:lineRule="auto"/>
+              <w:rPr>
+                <w:rFonts w:ascii="Arial Narrow" w:hAnsi="Arial Narrow" w:cs="Arial"/>
+                <w:lang w:val="en-US"/>
+              </w:rPr>
+            </w:pPr>
+            <w:r>
+              <w:rPr>
+                <w:rFonts w:ascii="Arial Narrow" w:hAnsi="Arial Narrow" w:cs="Arial"/>
+                <w:lang w:val="en-US"/>
+              </w:rPr>
+              <w:t xml:space="preserve">  //</w:t>
+            </w:r>
+            <w:r>
+              <w:rPr>
+                <w:rFonts w:ascii="Arial Narrow" w:hAnsi="Arial Narrow" w:cs="Arial"/>
+                <w:lang w:val="en-US"/>
+              </w:rPr>
+              <w:tab/>
+            </w:r>
+            <w:r>
+              <w:rPr>
+                <w:rFonts w:ascii="Arial Narrow" w:hAnsi="Arial Narrow" w:cs="Arial"/>
+                <w:lang w:val="en-US"/>
+              </w:rPr>
+              <w:tab/>
+            </w:r>
+            <w:r>
+              <w:rPr>
+                <w:rFonts w:ascii="Arial Narrow" w:hAnsi="Arial Narrow" w:cs="Arial"/>
+                <w:lang w:val="en-US"/>
+              </w:rPr>
+              <w:tab/>
+            </w:r>
+            <w:r>
+              <w:rPr>
+                <w:rFonts w:ascii="Arial Narrow" w:hAnsi="Arial Narrow" w:cs="Arial"/>
+                <w:lang w:val="en-US"/>
+              </w:rPr>
+              <w:tab/>
+            </w:r>
+            <w:r>
+              <w:rPr>
+                <w:rFonts w:ascii="Arial Narrow" w:hAnsi="Arial Narrow" w:cs="Arial"/>
+                <w:lang w:val="en-US"/>
+              </w:rPr>
+              <w:tab/>
+            </w:r>
+            <w:r>
+              <w:rPr>
+                <w:rFonts w:ascii="Arial Narrow" w:hAnsi="Arial Narrow" w:cs="Arial"/>
+                <w:lang w:val="en-US"/>
+              </w:rPr>
+              <w:tab/>
+            </w:r>
+            <w:r>
+              <w:rPr>
+                <w:rFonts w:ascii="Arial Narrow" w:hAnsi="Arial Narrow" w:cs="Arial"/>
+                <w:lang w:val="en-US"/>
+              </w:rPr>
+              <w:tab/>
+            </w:r>
+            <w:r>
+              <w:rPr>
+                <w:rFonts w:ascii="Arial Narrow" w:hAnsi="Arial Narrow" w:cs="Arial"/>
+                <w:lang w:val="en-US"/>
+              </w:rPr>
+              <w:tab/>
+            </w:r>
+            <w:r>
+              <w:rPr>
+                <w:rFonts w:ascii="Arial Narrow" w:hAnsi="Arial Narrow" w:cs="Arial"/>
+                <w:lang w:val="en-US"/>
+              </w:rPr>
+              <w:tab/>
+            </w:r>
+            <w:r>
+              <w:rPr>
+                <w:rFonts w:ascii="Arial Narrow" w:hAnsi="Arial Narrow" w:cs="Arial"/>
+                <w:lang w:val="en-US"/>
+              </w:rPr>
+              <w:tab/>
+              <w:t>conversion placeholder</w:t>
+            </w:r>
+          </w:p>
+          <w:p>
+            <w:pPr>
+              <w:spacing w:after="0" w:line="240" w:lineRule="auto"/>
+              <w:rPr>
+                <w:rFonts w:ascii="Arial Narrow" w:hAnsi="Arial Narrow" w:cs="Arial"/>
+                <w:lang w:val="en-US"/>
+              </w:rPr>
+            </w:pPr>
+            <w:r>
+              <w:rPr>
+                <w:rFonts w:ascii="Arial Narrow" w:hAnsi="Arial Narrow" w:cs="Arial"/>
+                <w:lang w:val="en-US"/>
+              </w:rPr>
+              <w:t xml:space="preserve">  ADC4-&gt;SQR1</w:t>
+            </w:r>
+            <w:r>
+              <w:rPr>
+                <w:rFonts w:ascii="Arial Narrow" w:hAnsi="Arial Narrow" w:cs="Arial"/>
+                <w:lang w:val="en-US"/>
+              </w:rPr>
+              <w:tab/>
+              <w:t>&amp;=</w:t>
+            </w:r>
+            <w:r>
+              <w:rPr>
+                <w:rFonts w:ascii="Arial Narrow" w:hAnsi="Arial Narrow" w:cs="Arial"/>
+                <w:lang w:val="en-US"/>
+              </w:rPr>
+              <w:tab/>
+              <w:t>~ADC_SQR1_L;</w:t>
+            </w:r>
+          </w:p>
+          <w:p>
+            <w:pPr>
+              <w:spacing w:after="0" w:line="240" w:lineRule="auto"/>
+              <w:rPr>
+                <w:rFonts w:ascii="Arial Narrow" w:hAnsi="Arial Narrow" w:cs="Arial"/>
+                <w:lang w:val="en-US"/>
+              </w:rPr>
+            </w:pPr>
+            <w:r>
+              <w:rPr>
+                <w:rFonts w:ascii="Arial Narrow" w:hAnsi="Arial Narrow" w:cs="Arial"/>
+                <w:lang w:val="en-US"/>
+              </w:rPr>
+              <w:t xml:space="preserve">  ADC4-&gt;SQR1</w:t>
+            </w:r>
+            <w:r>
+              <w:rPr>
+                <w:rFonts w:ascii="Arial Narrow" w:hAnsi="Arial Narrow" w:cs="Arial"/>
+                <w:lang w:val="en-US"/>
+              </w:rPr>
+              <w:tab/>
+              <w:t>|=</w:t>
+            </w:r>
+            <w:r>
+              <w:rPr>
+                <w:rFonts w:ascii="Arial Narrow" w:hAnsi="Arial Narrow" w:cs="Arial"/>
+                <w:lang w:val="en-US"/>
+              </w:rPr>
+              <w:tab/>
+              <w:t>5&lt;&lt;6;</w:t>
+            </w:r>
+          </w:p>
+          <w:p>
+            <w:pPr>
+              <w:spacing w:after="0" w:line="240" w:lineRule="auto"/>
+              <w:rPr>
+                <w:rFonts w:ascii="Arial Narrow" w:hAnsi="Arial Narrow" w:cs="Arial"/>
+                <w:lang w:val="en-US"/>
+              </w:rPr>
+            </w:pPr>
+          </w:p>
+          <w:p>
+            <w:pPr>
+              <w:spacing w:after="0" w:line="240" w:lineRule="auto"/>
+              <w:rPr>
+                <w:rFonts w:ascii="Arial Narrow" w:hAnsi="Arial Narrow" w:cs="Arial"/>
+                <w:lang w:val="en-US"/>
+              </w:rPr>
+            </w:pPr>
+            <w:r>
+              <w:rPr>
+                <w:rFonts w:ascii="Arial Narrow" w:hAnsi="Arial Narrow" w:cs="Arial"/>
+                <w:lang w:val="en-US"/>
+              </w:rPr>
+              <w:t xml:space="preserve">  // [19:18]:</w:t>
             </w:r>
             <w:r>
               <w:rPr>
@@ -3886,15 +4104,21 @@
                 <w:rFonts w:ascii="Arial Narrow" w:hAnsi="Arial Narrow" w:cs="Arial"/>
                 <w:lang w:val="en-US"/>
               </w:rPr>
-              <w:t>SQ1[4:0]:</w:t>
-            </w:r>
-            <w:r>
-              <w:rPr>
-                <w:rFonts w:ascii="Arial Narrow" w:hAnsi="Arial Narrow" w:cs="Arial"/>
-                <w:lang w:val="en-US"/>
-              </w:rPr>
-              <w:tab/>
-              <w:t>1st conversion in regular sequence</w:t>
+              <w:t>SMP5[2:0]:</w:t>
+            </w:r>
+            <w:r>
+              <w:rPr>
+                <w:rFonts w:ascii="Arial Narrow" w:hAnsi="Arial Narrow" w:cs="Arial"/>
+                <w:lang w:val="en-US"/>
+              </w:rPr>
+              <w:t xml:space="preserve"> </w:t>
+            </w:r>
+            <w:r>
+              <w:rPr>
+                <w:rFonts w:ascii="Arial Narrow" w:hAnsi="Arial Narrow" w:cs="Arial"/>
+                <w:lang w:val="en-US"/>
+              </w:rPr>
+              <w:t>Channel 5 sampling time selection</w:t>
             </w:r>
             <w:r>
               <w:rPr>
@@ -3910,7 +4134,7 @@
                 <w:lang w:val="en-US"/>
               </w:rPr>
               <w:tab/>
-              <w:t>00101</w:t>
+              <w:t>000</w:t>
             </w:r>
             <w:r>
               <w:rPr>
@@ -3926,110 +4150,23 @@
                 <w:lang w:val="en-US"/>
               </w:rPr>
               <w:tab/>
-              <w:t>Channel 5 is mapped into 1st</w:t>
-            </w:r>
-          </w:p>
-          <w:p>
-            <w:pPr>
-              <w:spacing w:after="0" w:line="240" w:lineRule="auto"/>
-              <w:rPr>
-                <w:rFonts w:ascii="Arial Narrow" w:hAnsi="Arial Narrow" w:cs="Arial"/>
-                <w:lang w:val="en-US"/>
-              </w:rPr>
-            </w:pPr>
-            <w:r>
-              <w:rPr>
-                <w:rFonts w:ascii="Arial Narrow" w:hAnsi="Arial Narrow" w:cs="Arial"/>
-                <w:lang w:val="en-US"/>
-              </w:rPr>
-              <w:t xml:space="preserve">  //</w:t>
-            </w:r>
-            <w:r>
-              <w:rPr>
-                <w:rFonts w:ascii="Arial Narrow" w:hAnsi="Arial Narrow" w:cs="Arial"/>
-                <w:lang w:val="en-US"/>
-              </w:rPr>
-              <w:tab/>
-            </w:r>
-            <w:r>
-              <w:rPr>
-                <w:rFonts w:ascii="Arial Narrow" w:hAnsi="Arial Narrow" w:cs="Arial"/>
-                <w:lang w:val="en-US"/>
-              </w:rPr>
-              <w:tab/>
-            </w:r>
-            <w:r>
-              <w:rPr>
-                <w:rFonts w:ascii="Arial Narrow" w:hAnsi="Arial Narrow" w:cs="Arial"/>
-                <w:lang w:val="en-US"/>
-              </w:rPr>
-              <w:tab/>
-            </w:r>
-            <w:r>
-              <w:rPr>
-                <w:rFonts w:ascii="Arial Narrow" w:hAnsi="Arial Narrow" w:cs="Arial"/>
-                <w:lang w:val="en-US"/>
-              </w:rPr>
-              <w:tab/>
-            </w:r>
-            <w:r>
-              <w:rPr>
-                <w:rFonts w:ascii="Arial Narrow" w:hAnsi="Arial Narrow" w:cs="Arial"/>
-                <w:lang w:val="en-US"/>
-              </w:rPr>
-              <w:tab/>
-            </w:r>
-            <w:r>
-              <w:rPr>
-                <w:rFonts w:ascii="Arial Narrow" w:hAnsi="Arial Narrow" w:cs="Arial"/>
-                <w:lang w:val="en-US"/>
-              </w:rPr>
-              <w:tab/>
-            </w:r>
-            <w:r>
-              <w:rPr>
-                <w:rFonts w:ascii="Arial Narrow" w:hAnsi="Arial Narrow" w:cs="Arial"/>
-                <w:lang w:val="en-US"/>
-              </w:rPr>
-              <w:tab/>
-            </w:r>
-            <w:r>
-              <w:rPr>
-                <w:rFonts w:ascii="Arial Narrow" w:hAnsi="Arial Narrow" w:cs="Arial"/>
-                <w:lang w:val="en-US"/>
-              </w:rPr>
-              <w:tab/>
-            </w:r>
-            <w:r>
-              <w:rPr>
-                <w:rFonts w:ascii="Arial Narrow" w:hAnsi="Arial Narrow" w:cs="Arial"/>
-                <w:lang w:val="en-US"/>
-              </w:rPr>
-              <w:tab/>
-            </w:r>
-            <w:r>
-              <w:rPr>
-                <w:rFonts w:ascii="Arial Narrow" w:hAnsi="Arial Narrow" w:cs="Arial"/>
-                <w:lang w:val="en-US"/>
-              </w:rPr>
-              <w:tab/>
-              <w:t>conversion placeholder</w:t>
-            </w:r>
-          </w:p>
-          <w:p>
-            <w:pPr>
-              <w:spacing w:after="0" w:line="240" w:lineRule="auto"/>
-              <w:rPr>
-                <w:rFonts w:ascii="Arial Narrow" w:hAnsi="Arial Narrow" w:cs="Arial"/>
-                <w:lang w:val="en-US"/>
-              </w:rPr>
-            </w:pPr>
-            <w:r>
-              <w:rPr>
-                <w:rFonts w:ascii="Arial Narrow" w:hAnsi="Arial Narrow" w:cs="Arial"/>
-                <w:lang w:val="en-US"/>
-              </w:rPr>
-              <w:t xml:space="preserve">  ADC4-&gt;SQR1</w:t>
+              <w:t>1.5 ADC clock cycles</w:t>
+            </w:r>
+          </w:p>
+          <w:p>
+            <w:pPr>
+              <w:spacing w:after="0" w:line="240" w:lineRule="auto"/>
+              <w:rPr>
+                <w:rFonts w:ascii="Arial Narrow" w:hAnsi="Arial Narrow" w:cs="Arial"/>
+                <w:lang w:val="en-US"/>
+              </w:rPr>
+            </w:pPr>
+            <w:r>
+              <w:rPr>
+                <w:rFonts w:ascii="Arial Narrow" w:hAnsi="Arial Narrow" w:cs="Arial"/>
+                <w:lang w:val="en-US"/>
+              </w:rPr>
+              <w:t xml:space="preserve">  ADC4-&gt;SMPR1</w:t>
             </w:r>
             <w:r>
               <w:rPr>
@@ -4045,23 +4182,116 @@
                 <w:lang w:val="en-US"/>
               </w:rPr>
               <w:tab/>
-              <w:t>~ADC_SQR1_L;</w:t>
-            </w:r>
-          </w:p>
-          <w:p>
-            <w:pPr>
-              <w:spacing w:after="0" w:line="240" w:lineRule="auto"/>
-              <w:rPr>
-                <w:rFonts w:ascii="Arial Narrow" w:hAnsi="Arial Narrow" w:cs="Arial"/>
-                <w:lang w:val="en-US"/>
-              </w:rPr>
-            </w:pPr>
-            <w:r>
-              <w:rPr>
-                <w:rFonts w:ascii="Arial Narrow" w:hAnsi="Arial Narrow" w:cs="Arial"/>
-                <w:lang w:val="en-US"/>
-              </w:rPr>
-              <w:t xml:space="preserve">  ADC4-&gt;SQR1</w:t>
+              <w:t>~ADC_SMPR1_SMP5;</w:t>
+            </w:r>
+          </w:p>
+          <w:p>
+            <w:pPr>
+              <w:spacing w:after="0" w:line="240" w:lineRule="auto"/>
+              <w:rPr>
+                <w:rFonts w:ascii="Arial Narrow" w:hAnsi="Arial Narrow" w:cs="Arial"/>
+                <w:lang w:val="en-US"/>
+              </w:rPr>
+            </w:pPr>
+          </w:p>
+          <w:p>
+            <w:pPr>
+              <w:spacing w:after="0" w:line="240" w:lineRule="auto"/>
+              <w:rPr>
+                <w:rFonts w:ascii="Arial Narrow" w:hAnsi="Arial Narrow" w:cs="Arial"/>
+                <w:lang w:val="en-US"/>
+              </w:rPr>
+            </w:pPr>
+            <w:r>
+              <w:rPr>
+                <w:rFonts w:ascii="Arial Narrow" w:hAnsi="Arial Narrow" w:cs="Arial"/>
+                <w:lang w:val="en-US"/>
+              </w:rPr>
+              <w:t xml:space="preserve">  // [0]:</w:t>
+            </w:r>
+            <w:r>
+              <w:rPr>
+                <w:rFonts w:ascii="Arial Narrow" w:hAnsi="Arial Narrow" w:cs="Arial"/>
+                <w:lang w:val="en-US"/>
+              </w:rPr>
+              <w:tab/>
+            </w:r>
+            <w:r>
+              <w:rPr>
+                <w:rFonts w:ascii="Arial Narrow" w:hAnsi="Arial Narrow" w:cs="Arial"/>
+                <w:lang w:val="en-US"/>
+              </w:rPr>
+              <w:tab/>
+              <w:t>ADEN:</w:t>
+            </w:r>
+            <w:r>
+              <w:rPr>
+                <w:rFonts w:ascii="Arial Narrow" w:hAnsi="Arial Narrow" w:cs="Arial"/>
+                <w:lang w:val="en-US"/>
+              </w:rPr>
+              <w:t xml:space="preserve"> </w:t>
+            </w:r>
+            <w:r>
+              <w:rPr>
+                <w:rFonts w:ascii="Arial Narrow" w:hAnsi="Arial Narrow" w:cs="Arial"/>
+                <w:lang w:val="en-US"/>
+              </w:rPr>
+              <w:t>ADC enable control</w:t>
+            </w:r>
+            <w:r>
+              <w:rPr>
+                <w:rFonts w:ascii="Arial Narrow" w:hAnsi="Arial Narrow" w:cs="Arial"/>
+                <w:lang w:val="en-US"/>
+              </w:rPr>
+              <w:tab/>
+            </w:r>
+            <w:r>
+              <w:rPr>
+                <w:rFonts w:ascii="Arial Narrow" w:hAnsi="Arial Narrow" w:cs="Arial"/>
+                <w:lang w:val="en-US"/>
+              </w:rPr>
+              <w:tab/>
+              <w:t>=</w:t>
+            </w:r>
+            <w:r>
+              <w:rPr>
+                <w:rFonts w:ascii="Arial Narrow" w:hAnsi="Arial Narrow" w:cs="Arial"/>
+                <w:lang w:val="en-US"/>
+              </w:rPr>
+              <w:tab/>
+              <w:t>0</w:t>
+            </w:r>
+            <w:r>
+              <w:rPr>
+                <w:rFonts w:ascii="Arial Narrow" w:hAnsi="Arial Narrow" w:cs="Arial"/>
+                <w:lang w:val="en-US"/>
+              </w:rPr>
+              <w:tab/>
+              <w:t>-&gt;</w:t>
+            </w:r>
+            <w:r>
+              <w:rPr>
+                <w:rFonts w:ascii="Arial Narrow" w:hAnsi="Arial Narrow" w:cs="Arial"/>
+                <w:lang w:val="en-US"/>
+              </w:rPr>
+              <w:tab/>
+              <w:t>ADC Enabled</w:t>
+            </w:r>
+          </w:p>
+          <w:p>
+            <w:pPr>
+              <w:spacing w:after="0" w:line="240" w:lineRule="auto"/>
+              <w:rPr>
+                <w:rFonts w:ascii="Arial Narrow" w:hAnsi="Arial Narrow" w:cs="Arial"/>
+                <w:lang w:val="en-US"/>
+              </w:rPr>
+            </w:pPr>
+            <w:r>
+              <w:rPr>
+                <w:rFonts w:ascii="Arial Narrow" w:hAnsi="Arial Narrow" w:cs="Arial"/>
+                <w:lang w:val="en-US"/>
+              </w:rPr>
+              <w:t xml:space="preserve">  ADC4-&gt;CR</w:t>
             </w:r>
             <w:r>
               <w:rPr>
@@ -4077,248 +4307,6 @@
                 <w:lang w:val="en-US"/>
               </w:rPr>
               <w:tab/>
-              <w:t>5&lt;&lt;6;</w:t>
-            </w:r>
-          </w:p>
-          <w:p>
-            <w:pPr>
-              <w:spacing w:after="0" w:line="240" w:lineRule="auto"/>
-              <w:rPr>
-                <w:rFonts w:ascii="Arial Narrow" w:hAnsi="Arial Narrow" w:cs="Arial"/>
-                <w:lang w:val="en-US"/>
-              </w:rPr>
-            </w:pPr>
-          </w:p>
-          <w:p>
-            <w:pPr>
-              <w:spacing w:after="0" w:line="240" w:lineRule="auto"/>
-              <w:rPr>
-                <w:rFonts w:ascii="Arial Narrow" w:hAnsi="Arial Narrow" w:cs="Arial"/>
-                <w:lang w:val="en-US"/>
-              </w:rPr>
-            </w:pPr>
-            <w:r>
-              <w:rPr>
-                <w:rFonts w:ascii="Arial Narrow" w:hAnsi="Arial Narrow" w:cs="Arial"/>
-                <w:lang w:val="en-US"/>
-              </w:rPr>
-              <w:t xml:space="preserve">  // [19:18]:</w:t>
-            </w:r>
-            <w:r>
-              <w:rPr>
-                <w:rFonts w:ascii="Arial Narrow" w:hAnsi="Arial Narrow" w:cs="Arial"/>
-                <w:lang w:val="en-US"/>
-              </w:rPr>
-              <w:t xml:space="preserve"> </w:t>
-            </w:r>
-            <w:r>
-              <w:rPr>
-                <w:rFonts w:ascii="Arial Narrow" w:hAnsi="Arial Narrow" w:cs="Arial"/>
-                <w:lang w:val="en-US"/>
-              </w:rPr>
-              <w:t>SMP5[2:0]:</w:t>
-            </w:r>
-            <w:r>
-              <w:rPr>
-                <w:rFonts w:ascii="Arial Narrow" w:hAnsi="Arial Narrow" w:cs="Arial"/>
-                <w:lang w:val="en-US"/>
-              </w:rPr>
-              <w:t xml:space="preserve"> </w:t>
-            </w:r>
-            <w:r>
-              <w:rPr>
-                <w:rFonts w:ascii="Arial Narrow" w:hAnsi="Arial Narrow" w:cs="Arial"/>
-                <w:lang w:val="en-US"/>
-              </w:rPr>
-              <w:t>Channel 5 sampling time selection</w:t>
-            </w:r>
-            <w:r>
-              <w:rPr>
-                <w:rFonts w:ascii="Arial Narrow" w:hAnsi="Arial Narrow" w:cs="Arial"/>
-                <w:lang w:val="en-US"/>
-              </w:rPr>
-              <w:tab/>
-              <w:t>=</w:t>
-            </w:r>
-            <w:r>
-              <w:rPr>
-                <w:rFonts w:ascii="Arial Narrow" w:hAnsi="Arial Narrow" w:cs="Arial"/>
-                <w:lang w:val="en-US"/>
-              </w:rPr>
-              <w:tab/>
-              <w:t>000</w:t>
-            </w:r>
-            <w:r>
-              <w:rPr>
-                <w:rFonts w:ascii="Arial Narrow" w:hAnsi="Arial Narrow" w:cs="Arial"/>
-                <w:lang w:val="en-US"/>
-              </w:rPr>
-              <w:tab/>
-              <w:t>-&gt;</w:t>
-            </w:r>
-            <w:r>
-              <w:rPr>
-                <w:rFonts w:ascii="Arial Narrow" w:hAnsi="Arial Narrow" w:cs="Arial"/>
-                <w:lang w:val="en-US"/>
-              </w:rPr>
-              <w:tab/>
-              <w:t>1.5 ADC clock cycles</w:t>
-            </w:r>
-          </w:p>
-          <w:p>
-            <w:pPr>
-              <w:spacing w:after="0" w:line="240" w:lineRule="auto"/>
-              <w:rPr>
-                <w:rFonts w:ascii="Arial Narrow" w:hAnsi="Arial Narrow" w:cs="Arial"/>
-                <w:lang w:val="en-US"/>
-              </w:rPr>
-            </w:pPr>
-            <w:r>
-              <w:rPr>
-                <w:rFonts w:ascii="Arial Narrow" w:hAnsi="Arial Narrow" w:cs="Arial"/>
-                <w:lang w:val="en-US"/>
-              </w:rPr>
-              <w:t xml:space="preserve">  ADC4-&gt;SMPR1</w:t>
-            </w:r>
-            <w:r>
-              <w:rPr>
-                <w:rFonts w:ascii="Arial Narrow" w:hAnsi="Arial Narrow" w:cs="Arial"/>
-                <w:lang w:val="en-US"/>
-              </w:rPr>
-              <w:tab/>
-              <w:t>&amp;=</w:t>
-            </w:r>
-            <w:r>
-              <w:rPr>
-                <w:rFonts w:ascii="Arial Narrow" w:hAnsi="Arial Narrow" w:cs="Arial"/>
-                <w:lang w:val="en-US"/>
-              </w:rPr>
-              <w:tab/>
-              <w:t>~ADC_SMPR1_SMP5;</w:t>
-            </w:r>
-          </w:p>
-          <w:p>
-            <w:pPr>
-              <w:spacing w:after="0" w:line="240" w:lineRule="auto"/>
-              <w:rPr>
-                <w:rFonts w:ascii="Arial Narrow" w:hAnsi="Arial Narrow" w:cs="Arial"/>
-                <w:lang w:val="en-US"/>
-              </w:rPr>
-            </w:pPr>
-          </w:p>
-          <w:p>
-            <w:pPr>
-              <w:spacing w:after="0" w:line="240" w:lineRule="auto"/>
-              <w:rPr>
-                <w:rFonts w:ascii="Arial Narrow" w:hAnsi="Arial Narrow" w:cs="Arial"/>
-                <w:lang w:val="en-US"/>
-              </w:rPr>
-            </w:pPr>
-            <w:r>
-              <w:rPr>
-                <w:rFonts w:ascii="Arial Narrow" w:hAnsi="Arial Narrow" w:cs="Arial"/>
-                <w:lang w:val="en-US"/>
-              </w:rPr>
-              <w:t xml:space="preserve">  // [0]:</w:t>
-            </w:r>
-            <w:r>
-              <w:rPr>
-                <w:rFonts w:ascii="Arial Narrow" w:hAnsi="Arial Narrow" w:cs="Arial"/>
-                <w:lang w:val="en-US"/>
-              </w:rPr>
-              <w:tab/>
-            </w:r>
-            <w:r>
-              <w:rPr>
-                <w:rFonts w:ascii="Arial Narrow" w:hAnsi="Arial Narrow" w:cs="Arial"/>
-                <w:lang w:val="en-US"/>
-              </w:rPr>
-              <w:tab/>
-              <w:t>ADEN:</w:t>
-            </w:r>
-            <w:r>
-              <w:rPr>
-                <w:rFonts w:ascii="Arial Narrow" w:hAnsi="Arial Narrow" w:cs="Arial"/>
-                <w:lang w:val="en-US"/>
-              </w:rPr>
-              <w:t xml:space="preserve"> </w:t>
-            </w:r>
-            <w:r>
-              <w:rPr>
-                <w:rFonts w:ascii="Arial Narrow" w:hAnsi="Arial Narrow" w:cs="Arial"/>
-                <w:lang w:val="en-US"/>
-              </w:rPr>
-              <w:t>ADC enable control</w:t>
-            </w:r>
-            <w:r>
-              <w:rPr>
-                <w:rFonts w:ascii="Arial Narrow" w:hAnsi="Arial Narrow" w:cs="Arial"/>
-                <w:lang w:val="en-US"/>
-              </w:rPr>
-              <w:tab/>
-            </w:r>
-            <w:r>
-              <w:rPr>
-                <w:rFonts w:ascii="Arial Narrow" w:hAnsi="Arial Narrow" w:cs="Arial"/>
-                <w:lang w:val="en-US"/>
-              </w:rPr>
-              <w:tab/>
-              <w:t>=</w:t>
-            </w:r>
-            <w:r>
-              <w:rPr>
-                <w:rFonts w:ascii="Arial Narrow" w:hAnsi="Arial Narrow" w:cs="Arial"/>
-                <w:lang w:val="en-US"/>
-              </w:rPr>
-              <w:tab/>
-              <w:t>0</w:t>
-            </w:r>
-            <w:r>
-              <w:rPr>
-                <w:rFonts w:ascii="Arial Narrow" w:hAnsi="Arial Narrow" w:cs="Arial"/>
-                <w:lang w:val="en-US"/>
-              </w:rPr>
-              <w:tab/>
-              <w:t>-&gt;</w:t>
-            </w:r>
-            <w:r>
-              <w:rPr>
-                <w:rFonts w:ascii="Arial Narrow" w:hAnsi="Arial Narrow" w:cs="Arial"/>
-                <w:lang w:val="en-US"/>
-              </w:rPr>
-              <w:tab/>
-              <w:t>ADC Enabled</w:t>
-            </w:r>
-          </w:p>
-          <w:p>
-            <w:pPr>
-              <w:spacing w:after="0" w:line="240" w:lineRule="auto"/>
-              <w:rPr>
-                <w:rFonts w:ascii="Arial Narrow" w:hAnsi="Arial Narrow" w:cs="Arial"/>
-                <w:lang w:val="en-US"/>
-              </w:rPr>
-            </w:pPr>
-            <w:r>
-              <w:rPr>
-                <w:rFonts w:ascii="Arial Narrow" w:hAnsi="Arial Narrow" w:cs="Arial"/>
-                <w:lang w:val="en-US"/>
-              </w:rPr>
-              <w:t xml:space="preserve">  ADC4-&gt;CR</w:t>
-            </w:r>
-            <w:r>
-              <w:rPr>
-                <w:rFonts w:ascii="Arial Narrow" w:hAnsi="Arial Narrow" w:cs="Arial"/>
-                <w:lang w:val="en-US"/>
-              </w:rPr>
-              <w:tab/>
-              <w:t>|=</w:t>
-            </w:r>
-            <w:r>
-              <w:rPr>
-                <w:rFonts w:ascii="Arial Narrow" w:hAnsi="Arial Narrow" w:cs="Arial"/>
-                <w:lang w:val="en-US"/>
-              </w:rPr>
-              <w:tab/>
               <w:t>ADC_CR_ADEN;</w:t>
             </w:r>
           </w:p>
@@ -4335,21 +4323,7 @@
                 <w:rFonts w:ascii="Arial Narrow" w:hAnsi="Arial Narrow" w:cs="Arial"/>
                 <w:lang w:val="en-US"/>
               </w:rPr>
-              <w:t xml:space="preserve">  while( !( ADC4-&gt;ISR &amp; ADC_ISR_ADRD ) );</w:t>
-            </w:r>
-            <w:r>
-              <w:rPr>
-                <w:rFonts w:ascii="Arial Narrow" w:hAnsi="Arial Narrow" w:cs="Arial"/>
-                <w:lang w:val="en-US"/>
-              </w:rPr>
-              <w:t xml:space="preserve"> </w:t>
-            </w:r>
-            <w:r>
-              <w:rPr>
-                <w:rFonts w:ascii="Arial Narrow" w:hAnsi="Arial Narrow" w:cs="Arial"/>
-                <w:lang w:val="en-US"/>
-              </w:rPr>
-              <w:t>// Waiting for ADC to stabilize</w:t>
+              <w:t xml:space="preserve">  while( !( ADC4-&gt;ISR &amp; ADC_ISR_ADRD ) ); // Waiting for ADC to stabilize</w:t>
             </w:r>
           </w:p>
           <w:p>
@@ -4461,9 +4435,15 @@
             <w:r>
               <w:rPr>
                 <w:rFonts w:ascii="Arial Narrow" w:hAnsi="Arial Narrow" w:cs="Arial"/>
-                <w:lang w:val="en-US"/>
-              </w:rPr>
-              <w:t xml:space="preserve">  /* Configuring TIM2 as Base Timer with T = 0.5s with interruption support */</w:t>
+              </w:rPr>
+              <w:t xml:space="preserve">  </w:t>
+            </w:r>
+            <w:r>
+              <w:rPr>
+                <w:rFonts w:ascii="Arial Narrow" w:hAnsi="Arial Narrow" w:cs="Arial"/>
+                <w:lang w:val="en-US"/>
+              </w:rPr>
+              <w:t>/* Configuring TIM2 as Base Timer with T = 0.5s with interruption support */</w:t>
             </w:r>
           </w:p>
           <w:p>
@@ -6024,21 +6004,7 @@
           <w:rFonts w:ascii="Arial Narrow" w:hAnsi="Arial Narrow"/>
           <w:lang w:val="en-US"/>
         </w:rPr>
-        <w:t>Explain how</w:t>
-      </w:r>
-      <w:r>
-        <w:rPr>
-          <w:rFonts w:ascii="Arial Narrow" w:hAnsi="Arial Narrow"/>
-          <w:lang w:val="en-US"/>
-        </w:rPr>
-        <w:t xml:space="preserve"> did you get reported result for this project (and also how it works)</w:t>
-      </w:r>
-      <w:r>
-        <w:rPr>
-          <w:rFonts w:ascii="Arial Narrow" w:hAnsi="Arial Narrow"/>
-          <w:lang w:val="en-US"/>
-        </w:rPr>
-        <w:t>:</w:t>
+        <w:t>Explain how did you get reported result for this project (and also how it works):</w:t>
       </w:r>
     </w:p>
     <w:p>
@@ -6096,29 +6062,7 @@
           <w:szCs w:val="20"/>
           <w:lang w:val="en-US"/>
         </w:rPr>
-        <w:t xml:space="preserve">the </w:t>
-      </w:r>
-      <w:r>
-        <w:rPr>
-          <w:rFonts w:ascii="Arial Narrow" w:hAnsi="Arial Narrow"/>
-          <w:i/>
-          <w:iCs/>
-          <w:sz w:val="20"/>
-          <w:szCs w:val="20"/>
-          <w:lang w:val="en-US"/>
-        </w:rPr>
-        <w:t>convolution</w:t>
-      </w:r>
-      <w:r>
-        <w:rPr>
-          <w:rFonts w:ascii="Arial Narrow" w:hAnsi="Arial Narrow"/>
-          <w:i/>
-          <w:iCs/>
-          <w:sz w:val="20"/>
-          <w:szCs w:val="20"/>
-          <w:lang w:val="en-US"/>
-        </w:rPr>
-        <w:t xml:space="preserve"> program</w:t>
+        <w:t>the convolution program</w:t>
       </w:r>
     </w:p>
     <w:tbl>
@@ -6379,7 +6323,7 @@
                 </wp:anchor>
               </w:drawing>
             </mc:Choice>
-            <mc:Fallback xmlns:w16du="http://schemas.microsoft.com/office/word/2023/wordml/word16du" xmlns:w16sdtfl="http://schemas.microsoft.com/office/word/2024/wordml/sdtformatlock">
+            <mc:Fallback xmlns:w16sdtfl="http://schemas.microsoft.com/office/word/2024/wordml/sdtformatlock" xmlns:w16du="http://schemas.microsoft.com/office/word/2023/wordml/word16du">
               <w:pict>
                 <v:rect w14:anchorId="523F16BE" id="Rectangle 58" o:spid="_x0000_s1026" style="position:absolute;margin-left:28.85pt;margin-top:7.7pt;width:558.2pt;height:3.6pt;z-index:-251644928;visibility:visible;mso-wrap-style:square;mso-width-percent:0;mso-height-percent:0;mso-wrap-distance-left:9pt;mso-wrap-distance-top:0;mso-wrap-distance-right:9pt;mso-wrap-distance-bottom:0;mso-position-horizontal:absolute;mso-position-horizontal-relative:page;mso-position-vertical:absolute;mso-position-vertical-relative:text;mso-width-percent:0;mso-height-percent:0;mso-width-relative:page;mso-height-relative:page;v-text-anchor:middle" o:gfxdata="UEsDBBQABgAIAAAAIQC2gziS/gAAAOEBAAATAAAAW0NvbnRlbnRfVHlwZXNdLnhtbJSRQU7DMBBF&#10;90jcwfIWJU67QAgl6YK0S0CoHGBkTxKLZGx5TGhvj5O2G0SRWNoz/78nu9wcxkFMGNg6quQqL6RA&#10;0s5Y6ir5vt9lD1JwBDIwOMJKHpHlpr69KfdHjyxSmriSfYz+USnWPY7AufNIadK6MEJMx9ApD/oD&#10;OlTrorhX2lFEilmcO2RdNtjC5xDF9pCuTyYBB5bi6bQ4syoJ3g9WQ0ymaiLzg5KdCXlKLjvcW893&#10;SUOqXwnz5DrgnHtJTxOsQfEKIT7DmDSUCaxw7Rqn8787ZsmRM9e2VmPeBN4uqYvTtW7jvijg9N/y&#10;JsXecLq0q+WD6m8AAAD//wMAUEsDBBQABgAIAAAAIQA4/SH/1gAAAJQBAAALAAAAX3JlbHMvLnJl&#10;bHOkkMFqwzAMhu+DvYPRfXGawxijTi+j0GvpHsDYimMaW0Yy2fr2M4PBMnrbUb/Q94l/f/hMi1qR&#10;JVI2sOt6UJgd+ZiDgffL8ekFlFSbvV0oo4EbChzGx4f9GRdb25HMsYhqlCwG5lrLq9biZkxWOiqY&#10;22YiTra2kYMu1l1tQD30/bPm3wwYN0x18gb45AdQl1tp5j/sFB2T0FQ7R0nTNEV3j6o9feQzro1i&#10;OWA14Fm+Q8a1a8+Bvu/d/dMb2JY5uiPbhG/ktn4cqGU/er3pcvwCAAD//wMAUEsDBBQABgAIAAAA&#10;IQCLs0F3AgIAAGoEAAAOAAAAZHJzL2Uyb0RvYy54bWysVNtuGyEQfa/Uf0C817u24ia1vM5DovSl&#10;lyhJP4CwgxcJGATEl7/vAOtN0lapVNUPmBlmzsw5DLu+PFjDdhCiRtfx+azlDJzEXrttx3883Hy4&#10;4Cwm4Xph0EHHjxD55eb9u/Xer2CBA5oeAiMQF1d73/EhJb9qmigHsCLO0IOjQ4XBikRm2DZ9EHtC&#10;t6ZZtO3HZo+h9wElxEje63rINwVfKZDpu1IREjMdp95SWUNZH/PabNZitQ3CD1qObYh/6MIK7ajo&#10;BHUtkmBPQf8GZbUMGFGlmUTboFJaQuFAbObtL2zuB+GhcCFxop9kiv8PVn7b3Qam+44v6aacsHRH&#10;d6SacFsDjHwk0N7HFcXd+9swWpG2me1BBZv/iQc7FFGPk6hwSEyS87y9+DQ/I+0lnZ0tzxdF9OY5&#10;2YeYPgNaljcdD1S9SCl2X2KighR6Csm1Ihrd32hjipHnBK5MYDtBN5wOi5JqnuxX7Ktv2dIv0yCc&#10;MlY5vFovkYzLeA4zcg3OniZzr2zLLh0N5Djj7kCRbMSvVpyQa1EhJbg0L83EQfTwt14KYEZWVH/C&#10;HgFekzxh1y7H+JwKZd6n5LZWfyt5yiiV0aUp2WqH4U8AhliNlWv8SaQqTVbpEfsjDVVI5grrsxNO&#10;DkivTqZQknMUDXS5hfHx5Rfz0i6wz5+IzU8AAAD//wMAUEsDBBQABgAIAAAAIQDdEk/q4AAAAAkB&#10;AAAPAAAAZHJzL2Rvd25yZXYueG1sTI/BTsMwEETvSPyDtUjcqJMobUqIUwESF8QB2qoSt228JAF7&#10;HcVuG/4e91SOszOaeVutJmvEkUbfO1aQzhIQxI3TPbcKtpuXuyUIH5A1Gsek4Jc8rOrrqwpL7U78&#10;Qcd1aEUsYV+igi6EoZTSNx1Z9DM3EEfvy40WQ5RjK/WIp1hujcySZCEt9hwXOhzouaPmZ32wCnIM&#10;m3CffL7v3kyyfHrdZlP7vVPq9mZ6fAARaAqXMJzxIzrUkWnvDqy9MArmRRGT8T7PQZz9tMhTEHsF&#10;WbYAWVfy/wf1HwAAAP//AwBQSwECLQAUAAYACAAAACEAtoM4kv4AAADhAQAAEwAAAAAAAAAAAAAA&#10;AAAAAAAAW0NvbnRlbnRfVHlwZXNdLnhtbFBLAQItABQABgAIAAAAIQA4/SH/1gAAAJQBAAALAAAA&#10;AAAAAAAAAAAAAC8BAABfcmVscy8ucmVsc1BLAQItABQABgAIAAAAIQCLs0F3AgIAAGoEAAAOAAAA&#10;AAAAAAAAAAAAAC4CAABkcnMvZTJvRG9jLnhtbFBLAQItABQABgAIAAAAIQDdEk/q4AAAAAkBAAAP&#10;AAAAAAAAAAAAAAAAAFwEAABkcnMvZG93bnJldi54bWxQSwUGAAAAAAQABADzAAAAaQUAAAAA&#10;" fillcolor="#0f243e [1615]" stroked="f" strokeweight="2pt">
                   <w10:wrap type="tight" anchorx="page"/>
@@ -6789,7 +6733,7 @@
             </wp:anchor>
           </w:drawing>
         </mc:Choice>
-        <mc:Fallback xmlns:w16du="http://schemas.microsoft.com/office/word/2023/wordml/word16du" xmlns:w16sdtfl="http://schemas.microsoft.com/office/word/2024/wordml/sdtformatlock">
+        <mc:Fallback xmlns:w16sdtfl="http://schemas.microsoft.com/office/word/2024/wordml/sdtformatlock" xmlns:w16du="http://schemas.microsoft.com/office/word/2023/wordml/word16du">
           <w:pict>
             <v:rect w14:anchorId="4AD48C64" id="Rectangle 25" o:spid="_x0000_s1026" style="position:absolute;margin-left:-13.3pt;margin-top:37.65pt;width:558.2pt;height:3.6pt;z-index:-251646976;visibility:visible;mso-wrap-style:square;mso-width-percent:0;mso-height-percent:0;mso-wrap-distance-left:9pt;mso-wrap-distance-top:7.2pt;mso-wrap-distance-right:9pt;mso-wrap-distance-bottom:7.2pt;mso-position-horizontal:absolute;mso-position-horizontal-relative:margin;mso-position-vertical:absolute;mso-position-vertical-relative:top-margin-area;mso-width-percent:0;mso-height-percent:0;mso-width-relative:margin;mso-height-relative:margin;v-text-anchor:middle" o:gfxdata="UEsDBBQABgAIAAAAIQC2gziS/gAAAOEBAAATAAAAW0NvbnRlbnRfVHlwZXNdLnhtbJSRQU7DMBBF&#10;90jcwfIWJU67QAgl6YK0S0CoHGBkTxKLZGx5TGhvj5O2G0SRWNoz/78nu9wcxkFMGNg6quQqL6RA&#10;0s5Y6ir5vt9lD1JwBDIwOMJKHpHlpr69KfdHjyxSmriSfYz+USnWPY7AufNIadK6MEJMx9ApD/oD&#10;OlTrorhX2lFEilmcO2RdNtjC5xDF9pCuTyYBB5bi6bQ4syoJ3g9WQ0ymaiLzg5KdCXlKLjvcW893&#10;SUOqXwnz5DrgnHtJTxOsQfEKIT7DmDSUCaxw7Rqn8787ZsmRM9e2VmPeBN4uqYvTtW7jvijg9N/y&#10;JsXecLq0q+WD6m8AAAD//wMAUEsDBBQABgAIAAAAIQA4/SH/1gAAAJQBAAALAAAAX3JlbHMvLnJl&#10;bHOkkMFqwzAMhu+DvYPRfXGawxijTi+j0GvpHsDYimMaW0Yy2fr2M4PBMnrbUb/Q94l/f/hMi1qR&#10;JVI2sOt6UJgd+ZiDgffL8ekFlFSbvV0oo4EbChzGx4f9GRdb25HMsYhqlCwG5lrLq9biZkxWOiqY&#10;22YiTra2kYMu1l1tQD30/bPm3wwYN0x18gb45AdQl1tp5j/sFB2T0FQ7R0nTNEV3j6o9feQzro1i&#10;OWA14Fm+Q8a1a8+Bvu/d/dMb2JY5uiPbhG/ktn4cqGU/er3pcvwCAAD//wMAUEsDBBQABgAIAAAA&#10;IQAILsZEAgIAAGoEAAAOAAAAZHJzL2Uyb0RvYy54bWysVNtuGyEQfa/Uf0C817u24ia1vM5DovSl&#10;lyhJP4CwgxcJGATEl7/vAOtN0lapVNUPmBlmzsw5DLu+PFjDdhCiRtfx+azlDJzEXrttx3883Hy4&#10;4Cwm4Xph0EHHjxD55eb9u/Xer2CBA5oeAiMQF1d73/EhJb9qmigHsCLO0IOjQ4XBikRm2DZ9EHtC&#10;t6ZZtO3HZo+h9wElxEje63rINwVfKZDpu1IREjMdp95SWUNZH/PabNZitQ3CD1qObYh/6MIK7ajo&#10;BHUtkmBPQf8GZbUMGFGlmUTboFJaQuFAbObtL2zuB+GhcCFxop9kiv8PVn7b3Qam+44vlpw5YemO&#10;7kg14bYGGPlIoL2PK4q797dhtCJtM9uDCjb/Ew92KKIeJ1HhkJgk53l78Wl+RtpLOjtbni+K6M1z&#10;sg8xfQa0LG86Hqh6kVLsvsREBSn0FJJrRTS6v9HGFCPPCVyZwHaCbjgdFiXVPNmv2FffsqVfpkE4&#10;ZaxyeLVeIhmX8Rxm5BqcPU3mXtmWXToayHHG3YEi2YhfrTgh16JCSnBpXpqJg+jhb70UwIysqP6E&#10;PQK8JnnCrl2O8TkVyrxPyW2t/lbylFEqo0tTstUOw58ADLEaK9f4k0hVmqzSI/ZHGqqQzBXWZyec&#10;HJBenUyhJOcoGuhyC+Pjyy/mpV1gnz8Rm58AAAD//wMAUEsDBBQABgAIAAAAIQBrX+Q94QAAAAoB&#10;AAAPAAAAZHJzL2Rvd25yZXYueG1sTI/BTsMwEETvSPyDtUjcWptAQ5pmUwESF8ShtFUlbm68TQLx&#10;OordNvw97gmOq32aeVMsR9uJEw2+dYxwN1UgiCtnWq4RtpvXSQbCB81Gd44J4Yc8LMvrq0Lnxp35&#10;g07rUIsYwj7XCE0IfS6lrxqy2k9dTxx/BzdYHeI51NIM+hzDbScTpVJpdcuxodE9vTRUfa+PFuFB&#10;h02Yq8/V7r1T2fPbNhnrrx3i7c34tAARaAx/MFz0ozqU0Wnvjmy86BAmSZpGFOFxdg/iAqhsHsfs&#10;EbJkBrIs5P8J5S8AAAD//wMAUEsBAi0AFAAGAAgAAAAhALaDOJL+AAAA4QEAABMAAAAAAAAAAAAA&#10;AAAAAAAAAFtDb250ZW50X1R5cGVzXS54bWxQSwECLQAUAAYACAAAACEAOP0h/9YAAACUAQAACwAA&#10;AAAAAAAAAAAAAAAvAQAAX3JlbHMvLnJlbHNQSwECLQAUAAYACAAAACEACC7GRAICAABqBAAADgAA&#10;AAAAAAAAAAAAAAAuAgAAZHJzL2Uyb0RvYy54bWxQSwECLQAUAAYACAAAACEAa1/kPeEAAAAKAQAA&#10;DwAAAAAAAAAAAAAAAABcBAAAZHJzL2Rvd25yZXYueG1sUEsFBgAAAAAEAAQA8wAAAGoFAAAAAA==&#10;" fillcolor="#0f243e [1615]" stroked="f" strokeweight="2pt">
               <w10:wrap type="square" anchorx="margin" anchory="margin"/>

</xml_diff>